<commit_message>
Capitolo 8 riscritto come conclusioni in prosa, controllo di rimandi, citazioni e immagini
- Capitolo 8: conclusioni in tre paragrafi senza sottotitolo e 8.1 Sviluppi futuri,
  sul modello della tesi di riferimento; risposta alla domanda in entrambe le parti
- Capitolo 7: la 7.4 rimanda al Capitolo 8
- Rimandi corretti: modalita' del PIR (2.1.3), rumore di fondo (Tabella 6.5),
  principio del respiro (2.2.2), attraversamento nella Tabella 4.1 (5.3.2)
- Capitolo 5: citazioni dei dati del costruttore (hcsr501, manuali dei due radar),
  frase incompleta sulla portata dell'LD2420
- Immagini recuperate: le cinque di Immagini/ e le sei foto e schermate dei moduli

Co-Authored-By: Claude Opus 5.5 <noreply@anthropic.com>
</commit_message>
<xml_diff>
--- a/bozza_capitolo5.docx
+++ b/bozza_capitolo5.docx
@@ -739,7 +739,7 @@
         <w:rPr>
           <w:lang w:val="it-IT"/>
         </w:rPr>
-        <w:t>La percentuale di campioni in cui il PIR è alto va letta sapendo come nasce. In posizione L l'uscita è un monostabile a durata fissa. Su tutte le sessioni acquisite in quella configurazione sono stati contati 195 impulsi con durata media 3,46 ± 0,09 s, tutti fra 3,4 e 3,6 s e nessuno oltre 5 s, anche nei trial in cui il soggetto si muoveva per cinque minuti (Figura 5.3). La percentuale è quindi il numero di eventi moltiplicato per la ritenuta, cioè un conteggio di eventi travestito da frazione di tempo. In posizione H gli impulsi si concatenano finché il movimento continua, fino a coprire un intero trial di 62 s, e la percentuale diventa allora una vera frazione di tempo con movimento rilevato. Il significato delle due modalità è descritto nella Sezione 2.1.1.</w:t>
+        <w:t>La percentuale di campioni in cui il PIR è alto va letta sapendo come nasce. In posizione L l'uscita è un monostabile a durata fissa. Su tutte le sessioni acquisite in quella configurazione sono stati contati 195 impulsi con durata media 3,46 ± 0,09 s, tutti fra 3,4 e 3,6 s e nessuno oltre 5 s, anche nei trial in cui il soggetto si muoveva per cinque minuti (Figura 5.3). La percentuale è quindi il numero di eventi moltiplicato per la ritenuta, cioè un conteggio di eventi travestito da frazione di tempo. In posizione H gli impulsi si concatenano finché il movimento continua, fino a coprire un intero trial di 62 s, e la percentuale diventa allora una vera frazione di tempo con movimento rilevato. Il significato delle due modalità è descritto nella Sezione 2.1.3.</w:t>
       </w:r>
     </w:p>
     <w:p>
@@ -1646,7 +1646,7 @@
         <w:rPr>
           <w:lang w:val="it-IT"/>
         </w:rPr>
-        <w:t>Il cammino sul posto è stato ripetuto a 1, 2, 3, 4 e 5 m, con cinque trial per distanza (in H a 1 e 2 m, in L da 3 a 5 m, dove il ponticello non cambia nulla). A 1 m il PIR rileva l'85,2 % del tempo, mentre da 2 m in poi resta a zero. Sono venti trial consecutivi al 100 % di falsi negativi con un soggetto in movimento continuo davanti al sensore, e il crollo fra 1 e 2 m non è graduale. Questo esito è in aperto contrasto con la portata di 3–7 m dichiarata dal costruttore, ma da solo non distingue fra due spiegazioni, cioè il tipo di movimento oppure un esemplare guasto o tarato male. Per decidere, il soggetto ha ripetuto la prova camminando in modo continuo trasversalmente all'asse del sensore, a distanza costante. Il resto è rimasto invariato (trimmer di sensibilità nella stessa posizione), con il ponticello in H e tre trial per distanza. Il risultato è in Figura 5.5.</w:t>
+        <w:t>Il cammino sul posto è stato ripetuto a 1, 2, 3, 4 e 5 m, con cinque trial per distanza (in H a 1 e 2 m, in L da 3 a 5 m, dove il ponticello non cambia nulla). A 1 m il PIR rileva l'85,2 % del tempo, mentre da 2 m in poi resta a zero. Sono venti trial consecutivi al 100 % di falsi negativi con un soggetto in movimento continuo davanti al sensore, e il crollo fra 1 e 2 m non è graduale. Questo esito è in aperto contrasto con la portata di 3–7 m dichiarata dal costruttore [hcsr501], ma da solo non distingue fra due spiegazioni, cioè il tipo di movimento oppure un esemplare guasto o tarato male. Per decidere, il soggetto ha ripetuto la prova camminando in modo continuo trasversalmente all'asse del sensore, a distanza costante. Il resto è rimasto invariato (trimmer di sensibilità nella stessa posizione), con il ponticello in H e tre trial per distanza. Il risultato è in Figura 5.5.</w:t>
       </w:r>
     </w:p>
     <w:p>
@@ -4119,7 +4119,7 @@
         <w:rPr>
           <w:lang w:val="it-IT"/>
         </w:rPr>
-        <w:t>Il soggetto siede su un arco di raggio 1 m a sei azimut (0, 45, 60, 75, 90 e 120°), con la sedia rivolta verso i sensori a ogni posizione, e oscilla lateralmente il busto con ampiezza costante. Il gate massimo vale 2 e i trial sono da uno a tre per angolo (Figura 5.11). L'HLK-LD2410B rileva al 100 % fino a 90° compresi, con l'energia che cala di due punti soli fra l'asse e i 90° (da 96,5 a 94,3), e crolla fra 90 e 120°. La copertura eccede quindi nettamente i ± 60° del manuale. Il PIR collassa prima, dal 100 % sull'asse al 12 % a 90° e a zero a 120°. Fra 45 e 75° la dispersione fra trial è però dell'ordine dell'effetto, e a 45° i tre trial danno 100, 100 e 33 %, per cui le sole affermazioni sostenibili riguardano i tre estremi. L'irripetibilità è essa stessa un risultato, lo stesso comportamento già visto nella zona intermedia della dose-risposta. L'HLK-LD2420 a 1 m ha il fascio utile fino a circa 75° ed è al fondo a 90°, più stretto dell'HLK-LD2410B e più largo dei ± 45 o ± 60° del suo manuale. Il confine è coerente anche con il margine ridotto del trasmettitore dell'esemplare (Sezione 3.2.6).</w:t>
+        <w:t>Il soggetto siede su un arco di raggio 1 m a sei azimut (0, 45, 60, 75, 90 e 120°), con la sedia rivolta verso i sensori a ogni posizione, e oscilla lateralmente il busto con ampiezza costante. Il gate massimo vale 2 e i trial sono da uno a tre per angolo (Figura 5.11). L'HLK-LD2410B rileva al 100 % fino a 90° compresi, con l'energia che cala di due punti soli fra l'asse e i 90° (da 96,5 a 94,3), e crolla fra 90 e 120°. La copertura eccede quindi nettamente i ± 60° del manuale [hilinkManualV104]. Il PIR collassa prima, dal 100 % sull'asse al 12 % a 90° e a zero a 120°. Fra 45 e 75° la dispersione fra trial è però dell'ordine dell'effetto, e a 45° i tre trial danno 100, 100 e 33 %, per cui le sole affermazioni sostenibili riguardano i tre estremi. L'irripetibilità è essa stessa un risultato, lo stesso comportamento già visto nella zona intermedia della dose-risposta. L'HLK-LD2420 a 1 m ha il fascio utile fino a circa 75° ed è al fondo a 90°, più stretto dell'HLK-LD2410B e più largo dei ± 45 o ± 60° del suo manuale [hilinkManualLD2420]. Il confine è coerente anche con il margine ridotto del trasmettitore dell'esemplare (Sezione 3.2.6).</w:t>
       </w:r>
     </w:p>
     <w:p>
@@ -5132,7 +5132,7 @@
         <w:rPr>
           <w:lang w:val="it-IT"/>
         </w:rPr>
-        <w:t>Il soggetto cammina sul posto, perché da fermo il canale stazionario satura e l'attenuazione non sarebbe misurabile. Le distanze sono due. L'HLK-LD2410B lavora a 3 m, dove la sua energia sta circa a metà scala, lontana sia dalla saturazione sia dal fondo. Il PIR lavora a 1 m, perché a 3 m già senza ostacolo non vede il movimento sul posto. L'HLK-LD2420 ha ripetuto la serie a 1 m, perché oltre l'esemplare non rileva (Sezione 5.10). Per l'HLK-LD2420 l'attenuazione è in decibel, 10·log10(E₀/E) sull'energia del gate della persona, con E₀ senza ostacolo ed E con l'ostacolo, la stessa conversione usata dal tool del produttore (Sezione 3.2.5). Il produttore non documenta però che quelle energie siano potenze, quindi il valore in decibel resta un'ipotesi. Il riferimento senza ostacolo è la media di sei trial a inizio e fine sessione, e i risultati sono in Tabella 5.6 e Figura 5.13.</w:t>
+        <w:t>Il soggetto cammina sul posto, perché da fermo il canale stazionario satura e l'attenuazione non sarebbe misurabile. Le distanze sono due. L'HLK-LD2410B lavora a 3 m, dove la sua energia sta circa a metà scala, lontana sia dalla saturazione sia dal fondo. Il PIR lavora a 1 m, perché a 3 m già senza ostacolo non vede il movimento sul posto. L'HLK-LD2420 ha ripetuto la serie a 1 m, perché oltre i 2 m l'esemplare non rileva (Sezione 5.10). Per l'HLK-LD2420 l'attenuazione è in decibel, 10·log10(E₀/E) sull'energia del gate della persona, con E₀ senza ostacolo ed E con l'ostacolo, la stessa conversione usata dal tool del produttore (Sezione 3.2.5). Il produttore non documenta però che quelle energie siano potenze, quindi il valore in decibel resta un'ipotesi. Il riferimento senza ostacolo è la media di sei trial a inizio e fine sessione, e i risultati sono in Tabella 5.6 e Figura 5.13.</w:t>
       </w:r>
     </w:p>
     <w:p>
@@ -6729,7 +6729,7 @@
         <w:rPr>
           <w:lang w:val="it-IT"/>
         </w:rPr>
-        <w:t>Con un'oscillazione trasversale sul posto di circa 50 cm il radar rileva al 100 % a 5 e 6 m e allo 0 % a 7 m in tre trial su tre. A 6 m la distanza riportata ha massimo esattamente 600 cm in cinque trial su cinque, con dispersione di 2–5 cm contro i 10–11 di 5 m. Non si tratta di una misura più precisa, ma del tetto degli otto gate da 75 cm configurati. La presenza a 6 m è retta dal canale stazionario (energia 62–82), mentre a 7 m i gate 7 e 8 restano molto sotto le soglie. Il tetto di 600 cm dichiarato dal manuale risulta così misurato.</w:t>
+        <w:t>Con un'oscillazione trasversale sul posto di circa 50 cm il radar rileva al 100 % a 5 e 6 m e allo 0 % a 7 m in tre trial su tre. A 6 m la distanza riportata ha massimo esattamente 600 cm in cinque trial su cinque, con dispersione di 2–5 cm contro i 10–11 di 5 m. Non si tratta di una misura più precisa, ma del tetto degli otto gate da 75 cm configurati. La presenza a 6 m è retta dal canale stazionario (energia 62–82), mentre a 7 m i gate 7 e 8 restano molto sotto le soglie. Il tetto di 600 cm dichiarato dal manuale [hilinkManualV104] risulta così misurato.</w:t>
       </w:r>
     </w:p>
     <w:p>
@@ -6750,7 +6750,7 @@
         <w:rPr>
           <w:lang w:val="it-IT"/>
         </w:rPr>
-        <w:t>Con il trimmer a metà corsa, la sensibilità usata in tutta la campagna, l'oscillazione trasversale è rilevata al 24–33 % anche a 7 m, dove il radar per configurazione non vede più nulla. L'attraversamento a circa 1 m/s, rilevato al 98,7 % a 5 m, scende invece a 0, 6 e 0 % nei tre trial a 6 m, e sale al 30 % se il transito è più veloce. Al limite della portata conta quindi anche la velocità del transito, oltre al tipo e all'ampiezza del movimento. Con il trimmer al massimo, in una serie a parte rispetto al resto della campagna, l'attraversamento è rilevato al 100, 100, 56,8 ± 18,0 e 14,7 ± 10,0 % a 5, 6, 7 e 8 m. Il limite sta quindi fra 7 e 8 m, coerente con i 3–7 m del datasheet, e supera il tetto del radar, ma solo per chi attraversa il campo.</w:t>
+        <w:t>Con il trimmer a metà corsa, la sensibilità usata in tutta la campagna, l'oscillazione trasversale è rilevata al 24–33 % anche a 7 m, dove il radar per configurazione non vede più nulla. L'attraversamento a circa 1 m/s, rilevato al 98,7 % a 5 m, scende invece a 0, 6 e 0 % nei tre trial a 6 m, e sale al 30 % se il transito è più veloce. Al limite della portata conta quindi anche la velocità del transito, oltre al tipo e all'ampiezza del movimento. Con il trimmer al massimo, in una serie a parte rispetto al resto della campagna, l'attraversamento è rilevato al 100, 100, 56,8 ± 18,0 e 14,7 ± 10,0 % a 5, 6, 7 e 8 m. Il limite sta quindi fra 7 e 8 m, coerente con i 3–7 m del datasheet [hcsr501], e supera il tetto del radar, ma solo per chi attraversa il campo.</w:t>
       </w:r>
     </w:p>
     <w:p>
@@ -6771,7 +6771,7 @@
         <w:rPr>
           <w:lang w:val="it-IT"/>
         </w:rPr>
-        <w:t xml:space="preserve">Con il gate massimo portato a 12 (840 cm), il valore di fabbrica che copre gli 8 m dichiarati, l'esemplare acquisisce a 1 m e mantiene a 2 m. Da 3 m in su le sue energie sono il </w:t>
+        <w:t xml:space="preserve">Con il gate massimo portato a 12 (840 cm), il valore di fabbrica che copre gli 8 m dichiarati [hilinkManualLD2420], l'esemplare acquisisce a 1 m e mantiene a 2 m. Da 3 m in su le sue energie sono il </w:t>
       </w:r>
       <w:r>
         <w:rPr>

</xml_diff>